<commit_message>
Update final research archive and reproducibility documentation
</commit_message>
<xml_diff>
--- a/publication_assets/main_tables/CER_Tables.docx
+++ b/publication_assets/main_tables/CER_Tables.docx
@@ -649,21 +649,14 @@
           <w:i/>
           <w:sz w:val="18"/>
         </w:rPr>
-        <w:t>Note. Warnings were retained because they reflected structurally valid model behav</w:t>
+        <w:t xml:space="preserve">Note. </w:t>
       </w:r>
       <w:r>
         <w:rPr>
           <w:i/>
           <w:sz w:val="18"/>
         </w:rPr>
-        <w:t>io</w:t>
-      </w:r>
-      <w:r>
-        <w:rPr>
-          <w:i/>
-          <w:sz w:val="18"/>
-        </w:rPr>
-        <w:t>r rather than technical failure.</w:t>
+        <w:t>The 333 retained QA warnings mainly reflect decision factors exceeding an internal eight-word guideline. Nine responses also exceeded the internal 35-word guideline for rationales. These were non-fatal formatting warnings, and all 360 responses passed structural validation.</w:t>
       </w:r>
     </w:p>
     <w:p>
@@ -1793,7 +1786,21 @@
           <w:i/>
           <w:sz w:val="18"/>
         </w:rPr>
-        <w:t>Note. The numerical country gap and explicit unsupported-geography coding are different outcomes. Their cross-model comparison is descriptive/exploratory.</w:t>
+        <w:t xml:space="preserve">Note. </w:t>
+      </w:r>
+      <w:r>
+        <w:rPr>
+          <w:i/>
+          <w:sz w:val="18"/>
+        </w:rPr>
+        <w:t xml:space="preserve">“Unsupported geography” refers to geographic assumptions not directly supported by the supplied pitch. It does not mean that these assumptions were independently confirmed to be incorrect or unfair. </w:t>
+      </w:r>
+      <w:r>
+        <w:rPr>
+          <w:i/>
+          <w:sz w:val="18"/>
+        </w:rPr>
+        <w:t>The numerical country gap and explicit unsupported-geography coding are different outcomes. Their cross-model comparison is descriptive/exploratory.</w:t>
       </w:r>
     </w:p>
     <w:p>
@@ -2860,14 +2867,60 @@
     </w:tbl>
     <w:p>
       <w:pPr>
-        <w:spacing w:before="100" w:after="40"/>
+        <w:spacing w:after="0"/>
+        <w:rPr>
+          <w:i/>
+          <w:sz w:val="18"/>
+        </w:rPr>
+      </w:pPr>
+    </w:p>
+    <w:p>
+      <w:pPr>
+        <w:spacing w:after="0"/>
+        <w:rPr>
+          <w:i/>
+          <w:sz w:val="18"/>
+        </w:rPr>
       </w:pPr>
       <w:r>
         <w:rPr>
           <w:i/>
           <w:sz w:val="18"/>
         </w:rPr>
-        <w:t>Note. Reliability statistics are pre-adjudication. The two evidence-status disagreements were resolved separately by the two human coders, while original coding files were preserved.</w:t>
+        <w:t>Note.</w:t>
+      </w:r>
+      <w:r>
+        <w:t xml:space="preserve"> </w:t>
+      </w:r>
+      <w:r>
+        <w:rPr>
+          <w:i/>
+          <w:iCs/>
+          <w:sz w:val="18"/>
+          <w:szCs w:val="18"/>
+        </w:rPr>
+        <w:t xml:space="preserve">“Unsupported geography” refers to geographic assumptions not directly supported by the supplied pitch. It does not mean that these assumptions were independently confirmed to be incorrect or unfair. </w:t>
+      </w:r>
+      <w:r>
+        <w:rPr>
+          <w:i/>
+          <w:sz w:val="18"/>
+        </w:rPr>
+        <w:t>Final-coding percentages use all 360 responses as the denominator; reliability statistics use the 72 double-coded responses.</w:t>
+      </w:r>
+      <w:r>
+        <w:rPr>
+          <w:i/>
+          <w:sz w:val="18"/>
+        </w:rPr>
+        <w:t xml:space="preserve"> Reliability statistics are pre-adjudication. The two evidence-status disagreements were resolved separately by the two human coders, while original coding files were preserved</w:t>
+      </w:r>
+      <w:r>
+        <w:rPr>
+          <w:i/>
+          <w:sz w:val="18"/>
+        </w:rPr>
+        <w:t>.</w:t>
       </w:r>
     </w:p>
     <w:p>

</xml_diff>